<commit_message>
fix: corrige memory leaks, listeners Firebase et cohérence livrables
- Ajout dispose() sur PageController (page_decouverte)
- Ajout _email.dispose() manquant (page_modification_profil)
- StreamSubscription annulé proprement avant re-listen (service_notifications, service_agenda)
- AgendaController.reset() ajouté au flux de déconnexion (page_profil, feuille_profil)
- L1: comptages services et dépendances mis à jour
- L2: nœud bookedSessions corrigé, notifications ajouté
- L3: logout 5→6 étapes avec AgendaController.reset()
- L4: email modifiable documenté, bonus share+Premium ajoutés
- L5: APK 54.2→57.9 MB corrigé
- L6: tous les comptages unifiés, services et nœuds Firebase corrects
- Docx régénérés
</commit_message>
<xml_diff>
--- a/livrables/docx/DIAPALER_AFRICA_Livrable3.docx
+++ b/livrables/docx/DIAPALER_AFRICA_Livrable3.docx
@@ -14337,7 +14337,7 @@
           <w:color w:val="1F2D3D"/>
           <w:sz w:val="18"/>
         </w:rPr>
-        <w:t xml:space="preserve">  // ── Nettoyage complet en 5 étapes</w:t>
+        <w:t xml:space="preserve">  // ── Nettoyage complet en 6 étapes</w:t>
       </w:r>
     </w:p>
     <w:p>
@@ -14382,37 +14382,52 @@
           <w:color w:val="1F2D3D"/>
           <w:sz w:val="18"/>
         </w:rPr>
-        <w:t xml:space="preserve">  UserProfileController.reset();          // 3. Réinitialise le profil en mémoire</w:t>
-      </w:r>
-    </w:p>
-    <w:p>
-      <w:pPr>
-        <w:spacing w:before="0" w:after="0"/>
-        <w:ind w:left="283"/>
-        <w:shd w:val="clear" w:color="auto" w:fill="F3F4F6"/>
-      </w:pPr>
-      <w:r>
-        <w:rPr>
-          <w:rFonts w:ascii="Courier New" w:hAnsi="Courier New"/>
-          <w:color w:val="1F2D3D"/>
-          <w:sz w:val="18"/>
-        </w:rPr>
-        <w:t xml:space="preserve">  appTabIndex.value = 0;                  // 4. Retour à l'onglet Accueil</w:t>
-      </w:r>
-    </w:p>
-    <w:p>
-      <w:pPr>
-        <w:spacing w:before="0" w:after="0"/>
-        <w:ind w:left="283"/>
-        <w:shd w:val="clear" w:color="auto" w:fill="F3F4F6"/>
-      </w:pPr>
-      <w:r>
-        <w:rPr>
-          <w:rFonts w:ascii="Courier New" w:hAnsi="Courier New"/>
-          <w:color w:val="1F2D3D"/>
-          <w:sz w:val="18"/>
-        </w:rPr>
-        <w:t xml:space="preserve">  await AuthService.signOut();           // 5. Révoque la session Firebase Auth</w:t>
+        <w:t xml:space="preserve">  await AgendaController.reset();         // 3. Vide les sessions agenda en mémoire</w:t>
+      </w:r>
+    </w:p>
+    <w:p>
+      <w:pPr>
+        <w:spacing w:before="0" w:after="0"/>
+        <w:ind w:left="283"/>
+        <w:shd w:val="clear" w:color="auto" w:fill="F3F4F6"/>
+      </w:pPr>
+      <w:r>
+        <w:rPr>
+          <w:rFonts w:ascii="Courier New" w:hAnsi="Courier New"/>
+          <w:color w:val="1F2D3D"/>
+          <w:sz w:val="18"/>
+        </w:rPr>
+        <w:t xml:space="preserve">  UserProfileController.reset();          // 4. Réinitialise le profil en mémoire</w:t>
+      </w:r>
+    </w:p>
+    <w:p>
+      <w:pPr>
+        <w:spacing w:before="0" w:after="0"/>
+        <w:ind w:left="283"/>
+        <w:shd w:val="clear" w:color="auto" w:fill="F3F4F6"/>
+      </w:pPr>
+      <w:r>
+        <w:rPr>
+          <w:rFonts w:ascii="Courier New" w:hAnsi="Courier New"/>
+          <w:color w:val="1F2D3D"/>
+          <w:sz w:val="18"/>
+        </w:rPr>
+        <w:t xml:space="preserve">  appTabIndex.value = 0;                  // 5. Retour à l'onglet Accueil</w:t>
+      </w:r>
+    </w:p>
+    <w:p>
+      <w:pPr>
+        <w:spacing w:before="0" w:after="0"/>
+        <w:ind w:left="283"/>
+        <w:shd w:val="clear" w:color="auto" w:fill="F3F4F6"/>
+      </w:pPr>
+      <w:r>
+        <w:rPr>
+          <w:rFonts w:ascii="Courier New" w:hAnsi="Courier New"/>
+          <w:color w:val="1F2D3D"/>
+          <w:sz w:val="18"/>
+        </w:rPr>
+        <w:t xml:space="preserve">  await AuthService.signOut();           // 6. Révoque la session Firebase Auth</w:t>
       </w:r>
     </w:p>
     <w:p>

</xml_diff>